<commit_message>
Added Nota field in galvanizado template
</commit_message>
<xml_diff>
--- a/templates/reporte_libreacion_galvanizado_1.docx
+++ b/templates/reporte_libreacion_galvanizado_1.docx
@@ -934,18 +934,36 @@
           <w:szCs w:val="22"/>
         </w:rPr>
       </w:pPr>
-    </w:p>
-    <w:p>
-      <w:pPr>
-        <w:tabs>
-          <w:tab w:val="left" w:pos="3740"/>
-        </w:tabs>
+      <w:r>
         <w:rPr>
           <w:rFonts w:ascii="Helvetica Neue" w:hAnsi="Helvetica Neue"/>
+          <w:b/>
+          <w:bCs/>
           <w:sz w:val="22"/>
           <w:szCs w:val="22"/>
         </w:rPr>
-      </w:pPr>
+        <w:t>{{ Metadatos.</w:t>
+      </w:r>
+      <w:r>
+        <w:rPr>
+          <w:rFonts w:ascii="Helvetica Neue" w:hAnsi="Helvetica Neue"/>
+          <w:b/>
+          <w:bCs/>
+          <w:sz w:val="22"/>
+          <w:szCs w:val="22"/>
+        </w:rPr>
+        <w:t>Observacion</w:t>
+      </w:r>
+      <w:r>
+        <w:rPr>
+          <w:rFonts w:ascii="Helvetica Neue" w:hAnsi="Helvetica Neue"/>
+          <w:b/>
+          <w:bCs/>
+          <w:sz w:val="22"/>
+          <w:szCs w:val="22"/>
+        </w:rPr>
+        <w:t xml:space="preserve"> }}</w:t>
+      </w:r>
     </w:p>
     <w:p>
       <w:pPr>

</xml_diff>